<commit_message>
complete Angular HandsOn - 4
</commit_message>
<xml_diff>
--- a/Angular_HandsOn/Angular.docx
+++ b/Angular_HandsOn/Angular.docx
@@ -90,6 +90,7 @@
         <w:rPr>
           <w:b/>
           <w:bCs/>
+          <w:noProof/>
           <w:sz w:val="28"/>
           <w:szCs w:val="28"/>
         </w:rPr>
@@ -148,6 +149,7 @@
         <w:rPr>
           <w:b/>
           <w:bCs/>
+          <w:noProof/>
           <w:sz w:val="28"/>
           <w:szCs w:val="28"/>
         </w:rPr>
@@ -206,6 +208,7 @@
         <w:rPr>
           <w:b/>
           <w:bCs/>
+          <w:noProof/>
           <w:sz w:val="28"/>
           <w:szCs w:val="28"/>
         </w:rPr>
@@ -264,6 +267,7 @@
         <w:rPr>
           <w:b/>
           <w:bCs/>
+          <w:noProof/>
           <w:sz w:val="28"/>
           <w:szCs w:val="28"/>
         </w:rPr>
@@ -365,6 +369,7 @@
         <w:rPr>
           <w:b/>
           <w:bCs/>
+          <w:noProof/>
           <w:sz w:val="28"/>
           <w:szCs w:val="28"/>
         </w:rPr>
@@ -421,6 +426,7 @@
       </w:pPr>
       <w:r>
         <w:rPr>
+          <w:noProof/>
           <w:sz w:val="28"/>
           <w:szCs w:val="28"/>
         </w:rPr>
@@ -585,6 +591,7 @@
         <w:rPr>
           <w:b/>
           <w:bCs/>
+          <w:noProof/>
           <w:sz w:val="28"/>
           <w:szCs w:val="28"/>
         </w:rPr>
@@ -643,6 +650,7 @@
         <w:rPr>
           <w:b/>
           <w:bCs/>
+          <w:noProof/>
           <w:sz w:val="28"/>
           <w:szCs w:val="28"/>
         </w:rPr>
@@ -701,6 +709,7 @@
         <w:rPr>
           <w:b/>
           <w:bCs/>
+          <w:noProof/>
           <w:sz w:val="28"/>
           <w:szCs w:val="28"/>
         </w:rPr>
@@ -826,6 +835,7 @@
         <w:rPr>
           <w:b/>
           <w:bCs/>
+          <w:noProof/>
           <w:sz w:val="28"/>
           <w:szCs w:val="28"/>
         </w:rPr>
@@ -884,6 +894,7 @@
         <w:rPr>
           <w:b/>
           <w:bCs/>
+          <w:noProof/>
           <w:sz w:val="28"/>
           <w:szCs w:val="28"/>
         </w:rPr>
@@ -942,6 +953,7 @@
         <w:rPr>
           <w:b/>
           <w:bCs/>
+          <w:noProof/>
           <w:sz w:val="28"/>
           <w:szCs w:val="28"/>
         </w:rPr>
@@ -1000,6 +1012,7 @@
         <w:rPr>
           <w:b/>
           <w:bCs/>
+          <w:noProof/>
           <w:sz w:val="28"/>
           <w:szCs w:val="28"/>
         </w:rPr>
@@ -1092,6 +1105,7 @@
         <w:rPr>
           <w:b/>
           <w:bCs/>
+          <w:noProof/>
           <w:sz w:val="28"/>
           <w:szCs w:val="28"/>
         </w:rPr>
@@ -1150,6 +1164,7 @@
         <w:rPr>
           <w:b/>
           <w:bCs/>
+          <w:noProof/>
           <w:sz w:val="28"/>
           <w:szCs w:val="28"/>
         </w:rPr>
@@ -1243,6 +1258,7 @@
         <w:rPr>
           <w:b/>
           <w:bCs/>
+          <w:noProof/>
           <w:sz w:val="28"/>
           <w:szCs w:val="28"/>
         </w:rPr>
@@ -1301,6 +1317,7 @@
         <w:rPr>
           <w:b/>
           <w:bCs/>
+          <w:noProof/>
           <w:sz w:val="28"/>
           <w:szCs w:val="28"/>
         </w:rPr>
@@ -1359,6 +1376,7 @@
         <w:rPr>
           <w:b/>
           <w:bCs/>
+          <w:noProof/>
           <w:sz w:val="28"/>
           <w:szCs w:val="28"/>
         </w:rPr>
@@ -1461,6 +1479,841 @@
           <w:szCs w:val="28"/>
         </w:rPr>
       </w:pPr>
+      <w:r>
+        <w:rPr>
+          <w:b/>
+          <w:bCs/>
+          <w:noProof/>
+          <w:sz w:val="28"/>
+          <w:szCs w:val="28"/>
+        </w:rPr>
+        <w:drawing>
+          <wp:inline distT="0" distB="0" distL="0" distR="0" wp14:anchorId="6ED3147F" wp14:editId="67492724">
+            <wp:extent cx="3383280" cy="1889598"/>
+            <wp:effectExtent l="0" t="0" r="7620" b="0"/>
+            <wp:docPr id="522154025" name="Picture 1"/>
+            <wp:cNvGraphicFramePr>
+              <a:graphicFrameLocks xmlns:a="http://schemas.openxmlformats.org/drawingml/2006/main" noChangeAspect="1"/>
+            </wp:cNvGraphicFramePr>
+            <a:graphic xmlns:a="http://schemas.openxmlformats.org/drawingml/2006/main">
+              <a:graphicData uri="http://schemas.openxmlformats.org/drawingml/2006/picture">
+                <pic:pic xmlns:pic="http://schemas.openxmlformats.org/drawingml/2006/picture">
+                  <pic:nvPicPr>
+                    <pic:cNvPr id="0" name="Picture 1"/>
+                    <pic:cNvPicPr>
+                      <a:picLocks noChangeAspect="1" noChangeArrowheads="1"/>
+                    </pic:cNvPicPr>
+                  </pic:nvPicPr>
+                  <pic:blipFill>
+                    <a:blip r:embed="rId23">
+                      <a:extLst>
+                        <a:ext uri="{28A0092B-C50C-407E-A947-70E740481C1C}">
+                          <a14:useLocalDpi xmlns:a14="http://schemas.microsoft.com/office/drawing/2010/main" val="0"/>
+                        </a:ext>
+                      </a:extLst>
+                    </a:blip>
+                    <a:srcRect/>
+                    <a:stretch>
+                      <a:fillRect/>
+                    </a:stretch>
+                  </pic:blipFill>
+                  <pic:spPr bwMode="auto">
+                    <a:xfrm>
+                      <a:off x="0" y="0"/>
+                      <a:ext cx="3396479" cy="1896970"/>
+                    </a:xfrm>
+                    <a:prstGeom prst="rect">
+                      <a:avLst/>
+                    </a:prstGeom>
+                    <a:noFill/>
+                    <a:ln>
+                      <a:noFill/>
+                    </a:ln>
+                  </pic:spPr>
+                </pic:pic>
+              </a:graphicData>
+            </a:graphic>
+          </wp:inline>
+        </w:drawing>
+      </w:r>
+    </w:p>
+    <w:p>
+      <w:pPr>
+        <w:pStyle w:val="ListParagraph"/>
+        <w:numPr>
+          <w:ilvl w:val="2"/>
+          <w:numId w:val="1"/>
+        </w:numPr>
+        <w:rPr>
+          <w:b/>
+          <w:bCs/>
+          <w:sz w:val="28"/>
+          <w:szCs w:val="28"/>
+        </w:rPr>
+      </w:pPr>
+      <w:r>
+        <w:rPr>
+          <w:b/>
+          <w:bCs/>
+          <w:noProof/>
+          <w:sz w:val="28"/>
+          <w:szCs w:val="28"/>
+        </w:rPr>
+        <w:drawing>
+          <wp:inline distT="0" distB="0" distL="0" distR="0" wp14:anchorId="408B28D2" wp14:editId="2F00671A">
+            <wp:extent cx="3863340" cy="2021695"/>
+            <wp:effectExtent l="0" t="0" r="3810" b="0"/>
+            <wp:docPr id="781870283" name="Picture 2"/>
+            <wp:cNvGraphicFramePr>
+              <a:graphicFrameLocks xmlns:a="http://schemas.openxmlformats.org/drawingml/2006/main" noChangeAspect="1"/>
+            </wp:cNvGraphicFramePr>
+            <a:graphic xmlns:a="http://schemas.openxmlformats.org/drawingml/2006/main">
+              <a:graphicData uri="http://schemas.openxmlformats.org/drawingml/2006/picture">
+                <pic:pic xmlns:pic="http://schemas.openxmlformats.org/drawingml/2006/picture">
+                  <pic:nvPicPr>
+                    <pic:cNvPr id="0" name="Picture 2"/>
+                    <pic:cNvPicPr>
+                      <a:picLocks noChangeAspect="1" noChangeArrowheads="1"/>
+                    </pic:cNvPicPr>
+                  </pic:nvPicPr>
+                  <pic:blipFill>
+                    <a:blip r:embed="rId24" cstate="print">
+                      <a:extLst>
+                        <a:ext uri="{28A0092B-C50C-407E-A947-70E740481C1C}">
+                          <a14:useLocalDpi xmlns:a14="http://schemas.microsoft.com/office/drawing/2010/main" val="0"/>
+                        </a:ext>
+                      </a:extLst>
+                    </a:blip>
+                    <a:srcRect/>
+                    <a:stretch>
+                      <a:fillRect/>
+                    </a:stretch>
+                  </pic:blipFill>
+                  <pic:spPr bwMode="auto">
+                    <a:xfrm>
+                      <a:off x="0" y="0"/>
+                      <a:ext cx="3878906" cy="2029841"/>
+                    </a:xfrm>
+                    <a:prstGeom prst="rect">
+                      <a:avLst/>
+                    </a:prstGeom>
+                    <a:noFill/>
+                    <a:ln>
+                      <a:noFill/>
+                    </a:ln>
+                  </pic:spPr>
+                </pic:pic>
+              </a:graphicData>
+            </a:graphic>
+          </wp:inline>
+        </w:drawing>
+      </w:r>
+    </w:p>
+    <w:p>
+      <w:pPr>
+        <w:pStyle w:val="ListParagraph"/>
+        <w:numPr>
+          <w:ilvl w:val="2"/>
+          <w:numId w:val="1"/>
+        </w:numPr>
+        <w:rPr>
+          <w:b/>
+          <w:bCs/>
+          <w:sz w:val="28"/>
+          <w:szCs w:val="28"/>
+        </w:rPr>
+      </w:pPr>
+      <w:r>
+        <w:rPr>
+          <w:b/>
+          <w:bCs/>
+          <w:sz w:val="28"/>
+          <w:szCs w:val="28"/>
+        </w:rPr>
+        <w:drawing>
+          <wp:inline distT="0" distB="0" distL="0" distR="0" wp14:anchorId="56AA57E3" wp14:editId="7688767E">
+            <wp:extent cx="4192270" cy="1731065"/>
+            <wp:effectExtent l="0" t="0" r="0" b="2540"/>
+            <wp:docPr id="626151497" name="Picture 1"/>
+            <wp:cNvGraphicFramePr>
+              <a:graphicFrameLocks xmlns:a="http://schemas.openxmlformats.org/drawingml/2006/main" noChangeAspect="1"/>
+            </wp:cNvGraphicFramePr>
+            <a:graphic xmlns:a="http://schemas.openxmlformats.org/drawingml/2006/main">
+              <a:graphicData uri="http://schemas.openxmlformats.org/drawingml/2006/picture">
+                <pic:pic xmlns:pic="http://schemas.openxmlformats.org/drawingml/2006/picture">
+                  <pic:nvPicPr>
+                    <pic:cNvPr id="626151497" name=""/>
+                    <pic:cNvPicPr/>
+                  </pic:nvPicPr>
+                  <pic:blipFill>
+                    <a:blip r:embed="rId25"/>
+                    <a:stretch>
+                      <a:fillRect/>
+                    </a:stretch>
+                  </pic:blipFill>
+                  <pic:spPr>
+                    <a:xfrm>
+                      <a:off x="0" y="0"/>
+                      <a:ext cx="4198482" cy="1733630"/>
+                    </a:xfrm>
+                    <a:prstGeom prst="rect">
+                      <a:avLst/>
+                    </a:prstGeom>
+                  </pic:spPr>
+                </pic:pic>
+              </a:graphicData>
+            </a:graphic>
+          </wp:inline>
+        </w:drawing>
+      </w:r>
+    </w:p>
+    <w:p>
+      <w:pPr>
+        <w:pStyle w:val="ListParagraph"/>
+        <w:numPr>
+          <w:ilvl w:val="2"/>
+          <w:numId w:val="1"/>
+        </w:numPr>
+        <w:rPr>
+          <w:b/>
+          <w:bCs/>
+          <w:sz w:val="28"/>
+          <w:szCs w:val="28"/>
+        </w:rPr>
+      </w:pPr>
+      <w:r>
+        <w:rPr>
+          <w:b/>
+          <w:bCs/>
+          <w:sz w:val="28"/>
+          <w:szCs w:val="28"/>
+        </w:rPr>
+        <w:drawing>
+          <wp:inline distT="0" distB="0" distL="0" distR="0" wp14:anchorId="54D636F6" wp14:editId="40845727">
+            <wp:extent cx="4427220" cy="2391716"/>
+            <wp:effectExtent l="0" t="0" r="0" b="8890"/>
+            <wp:docPr id="738346851" name="Picture 1"/>
+            <wp:cNvGraphicFramePr>
+              <a:graphicFrameLocks xmlns:a="http://schemas.openxmlformats.org/drawingml/2006/main" noChangeAspect="1"/>
+            </wp:cNvGraphicFramePr>
+            <a:graphic xmlns:a="http://schemas.openxmlformats.org/drawingml/2006/main">
+              <a:graphicData uri="http://schemas.openxmlformats.org/drawingml/2006/picture">
+                <pic:pic xmlns:pic="http://schemas.openxmlformats.org/drawingml/2006/picture">
+                  <pic:nvPicPr>
+                    <pic:cNvPr id="738346851" name=""/>
+                    <pic:cNvPicPr/>
+                  </pic:nvPicPr>
+                  <pic:blipFill>
+                    <a:blip r:embed="rId26"/>
+                    <a:stretch>
+                      <a:fillRect/>
+                    </a:stretch>
+                  </pic:blipFill>
+                  <pic:spPr>
+                    <a:xfrm>
+                      <a:off x="0" y="0"/>
+                      <a:ext cx="4435081" cy="2395963"/>
+                    </a:xfrm>
+                    <a:prstGeom prst="rect">
+                      <a:avLst/>
+                    </a:prstGeom>
+                  </pic:spPr>
+                </pic:pic>
+              </a:graphicData>
+            </a:graphic>
+          </wp:inline>
+        </w:drawing>
+      </w:r>
+    </w:p>
+    <w:p>
+      <w:pPr>
+        <w:rPr>
+          <w:b/>
+          <w:bCs/>
+          <w:sz w:val="28"/>
+          <w:szCs w:val="28"/>
+        </w:rPr>
+      </w:pPr>
+    </w:p>
+    <w:p>
+      <w:pPr>
+        <w:pStyle w:val="ListParagraph"/>
+        <w:numPr>
+          <w:ilvl w:val="1"/>
+          <w:numId w:val="1"/>
+        </w:numPr>
+        <w:rPr>
+          <w:b/>
+          <w:bCs/>
+          <w:sz w:val="28"/>
+          <w:szCs w:val="28"/>
+        </w:rPr>
+      </w:pPr>
+      <w:r>
+        <w:rPr>
+          <w:b/>
+          <w:bCs/>
+          <w:sz w:val="28"/>
+          <w:szCs w:val="28"/>
+        </w:rPr>
+        <w:t>Task 2:</w:t>
+      </w:r>
+    </w:p>
+    <w:p>
+      <w:pPr>
+        <w:pStyle w:val="ListParagraph"/>
+        <w:numPr>
+          <w:ilvl w:val="2"/>
+          <w:numId w:val="1"/>
+        </w:numPr>
+        <w:rPr>
+          <w:b/>
+          <w:bCs/>
+          <w:sz w:val="28"/>
+          <w:szCs w:val="28"/>
+        </w:rPr>
+      </w:pPr>
+      <w:r>
+        <w:rPr>
+          <w:b/>
+          <w:bCs/>
+          <w:sz w:val="28"/>
+          <w:szCs w:val="28"/>
+        </w:rPr>
+        <w:drawing>
+          <wp:inline distT="0" distB="0" distL="0" distR="0" wp14:anchorId="4EEA071F" wp14:editId="17F26605">
+            <wp:extent cx="4443730" cy="2369563"/>
+            <wp:effectExtent l="0" t="0" r="0" b="0"/>
+            <wp:docPr id="1798274406" name="Picture 1"/>
+            <wp:cNvGraphicFramePr>
+              <a:graphicFrameLocks xmlns:a="http://schemas.openxmlformats.org/drawingml/2006/main" noChangeAspect="1"/>
+            </wp:cNvGraphicFramePr>
+            <a:graphic xmlns:a="http://schemas.openxmlformats.org/drawingml/2006/main">
+              <a:graphicData uri="http://schemas.openxmlformats.org/drawingml/2006/picture">
+                <pic:pic xmlns:pic="http://schemas.openxmlformats.org/drawingml/2006/picture">
+                  <pic:nvPicPr>
+                    <pic:cNvPr id="1798274406" name=""/>
+                    <pic:cNvPicPr/>
+                  </pic:nvPicPr>
+                  <pic:blipFill>
+                    <a:blip r:embed="rId27"/>
+                    <a:stretch>
+                      <a:fillRect/>
+                    </a:stretch>
+                  </pic:blipFill>
+                  <pic:spPr>
+                    <a:xfrm>
+                      <a:off x="0" y="0"/>
+                      <a:ext cx="4452198" cy="2374079"/>
+                    </a:xfrm>
+                    <a:prstGeom prst="rect">
+                      <a:avLst/>
+                    </a:prstGeom>
+                  </pic:spPr>
+                </pic:pic>
+              </a:graphicData>
+            </a:graphic>
+          </wp:inline>
+        </w:drawing>
+      </w:r>
+    </w:p>
+    <w:p>
+      <w:pPr>
+        <w:pStyle w:val="ListParagraph"/>
+        <w:numPr>
+          <w:ilvl w:val="2"/>
+          <w:numId w:val="1"/>
+        </w:numPr>
+        <w:rPr>
+          <w:b/>
+          <w:bCs/>
+          <w:sz w:val="28"/>
+          <w:szCs w:val="28"/>
+        </w:rPr>
+      </w:pPr>
+      <w:r>
+        <w:rPr>
+          <w:b/>
+          <w:bCs/>
+          <w:sz w:val="28"/>
+          <w:szCs w:val="28"/>
+        </w:rPr>
+        <w:drawing>
+          <wp:inline distT="0" distB="0" distL="0" distR="0" wp14:anchorId="72B1CBD0" wp14:editId="372E255A">
+            <wp:extent cx="4427220" cy="2149354"/>
+            <wp:effectExtent l="0" t="0" r="0" b="3810"/>
+            <wp:docPr id="1841771378" name="Picture 1"/>
+            <wp:cNvGraphicFramePr>
+              <a:graphicFrameLocks xmlns:a="http://schemas.openxmlformats.org/drawingml/2006/main" noChangeAspect="1"/>
+            </wp:cNvGraphicFramePr>
+            <a:graphic xmlns:a="http://schemas.openxmlformats.org/drawingml/2006/main">
+              <a:graphicData uri="http://schemas.openxmlformats.org/drawingml/2006/picture">
+                <pic:pic xmlns:pic="http://schemas.openxmlformats.org/drawingml/2006/picture">
+                  <pic:nvPicPr>
+                    <pic:cNvPr id="1841771378" name=""/>
+                    <pic:cNvPicPr/>
+                  </pic:nvPicPr>
+                  <pic:blipFill>
+                    <a:blip r:embed="rId28"/>
+                    <a:stretch>
+                      <a:fillRect/>
+                    </a:stretch>
+                  </pic:blipFill>
+                  <pic:spPr>
+                    <a:xfrm>
+                      <a:off x="0" y="0"/>
+                      <a:ext cx="4443200" cy="2157112"/>
+                    </a:xfrm>
+                    <a:prstGeom prst="rect">
+                      <a:avLst/>
+                    </a:prstGeom>
+                  </pic:spPr>
+                </pic:pic>
+              </a:graphicData>
+            </a:graphic>
+          </wp:inline>
+        </w:drawing>
+      </w:r>
+    </w:p>
+    <w:p>
+      <w:pPr>
+        <w:pStyle w:val="ListParagraph"/>
+        <w:numPr>
+          <w:ilvl w:val="2"/>
+          <w:numId w:val="1"/>
+        </w:numPr>
+        <w:rPr>
+          <w:b/>
+          <w:bCs/>
+          <w:sz w:val="28"/>
+          <w:szCs w:val="28"/>
+        </w:rPr>
+      </w:pPr>
+      <w:r>
+        <w:rPr>
+          <w:b/>
+          <w:bCs/>
+          <w:sz w:val="28"/>
+          <w:szCs w:val="28"/>
+        </w:rPr>
+        <w:drawing>
+          <wp:inline distT="0" distB="0" distL="0" distR="0" wp14:anchorId="2A1BC6D3" wp14:editId="0D2007A7">
+            <wp:extent cx="4551419" cy="2292350"/>
+            <wp:effectExtent l="0" t="0" r="1905" b="0"/>
+            <wp:docPr id="237799296" name="Picture 1"/>
+            <wp:cNvGraphicFramePr>
+              <a:graphicFrameLocks xmlns:a="http://schemas.openxmlformats.org/drawingml/2006/main" noChangeAspect="1"/>
+            </wp:cNvGraphicFramePr>
+            <a:graphic xmlns:a="http://schemas.openxmlformats.org/drawingml/2006/main">
+              <a:graphicData uri="http://schemas.openxmlformats.org/drawingml/2006/picture">
+                <pic:pic xmlns:pic="http://schemas.openxmlformats.org/drawingml/2006/picture">
+                  <pic:nvPicPr>
+                    <pic:cNvPr id="237799296" name=""/>
+                    <pic:cNvPicPr/>
+                  </pic:nvPicPr>
+                  <pic:blipFill>
+                    <a:blip r:embed="rId29"/>
+                    <a:stretch>
+                      <a:fillRect/>
+                    </a:stretch>
+                  </pic:blipFill>
+                  <pic:spPr>
+                    <a:xfrm>
+                      <a:off x="0" y="0"/>
+                      <a:ext cx="4556321" cy="2294819"/>
+                    </a:xfrm>
+                    <a:prstGeom prst="rect">
+                      <a:avLst/>
+                    </a:prstGeom>
+                  </pic:spPr>
+                </pic:pic>
+              </a:graphicData>
+            </a:graphic>
+          </wp:inline>
+        </w:drawing>
+      </w:r>
+    </w:p>
+    <w:p>
+      <w:pPr>
+        <w:rPr>
+          <w:b/>
+          <w:bCs/>
+          <w:sz w:val="28"/>
+          <w:szCs w:val="28"/>
+        </w:rPr>
+      </w:pPr>
+    </w:p>
+    <w:p>
+      <w:pPr>
+        <w:pStyle w:val="ListParagraph"/>
+        <w:numPr>
+          <w:ilvl w:val="1"/>
+          <w:numId w:val="1"/>
+        </w:numPr>
+        <w:rPr>
+          <w:b/>
+          <w:bCs/>
+          <w:sz w:val="28"/>
+          <w:szCs w:val="28"/>
+        </w:rPr>
+      </w:pPr>
+      <w:r>
+        <w:rPr>
+          <w:b/>
+          <w:bCs/>
+          <w:sz w:val="28"/>
+          <w:szCs w:val="28"/>
+        </w:rPr>
+        <w:t>Task 3</w:t>
+      </w:r>
+    </w:p>
+    <w:p>
+      <w:pPr>
+        <w:pStyle w:val="ListParagraph"/>
+        <w:numPr>
+          <w:ilvl w:val="2"/>
+          <w:numId w:val="1"/>
+        </w:numPr>
+        <w:rPr>
+          <w:b/>
+          <w:bCs/>
+          <w:sz w:val="28"/>
+          <w:szCs w:val="28"/>
+        </w:rPr>
+      </w:pPr>
+      <w:r>
+        <w:rPr>
+          <w:b/>
+          <w:bCs/>
+          <w:sz w:val="28"/>
+          <w:szCs w:val="28"/>
+        </w:rPr>
+        <w:drawing>
+          <wp:inline distT="0" distB="0" distL="0" distR="0" wp14:anchorId="68E906B8" wp14:editId="778BFEC2">
+            <wp:extent cx="4519930" cy="2818822"/>
+            <wp:effectExtent l="0" t="0" r="0" b="635"/>
+            <wp:docPr id="1011669494" name="Picture 1"/>
+            <wp:cNvGraphicFramePr>
+              <a:graphicFrameLocks xmlns:a="http://schemas.openxmlformats.org/drawingml/2006/main" noChangeAspect="1"/>
+            </wp:cNvGraphicFramePr>
+            <a:graphic xmlns:a="http://schemas.openxmlformats.org/drawingml/2006/main">
+              <a:graphicData uri="http://schemas.openxmlformats.org/drawingml/2006/picture">
+                <pic:pic xmlns:pic="http://schemas.openxmlformats.org/drawingml/2006/picture">
+                  <pic:nvPicPr>
+                    <pic:cNvPr id="1011669494" name=""/>
+                    <pic:cNvPicPr/>
+                  </pic:nvPicPr>
+                  <pic:blipFill>
+                    <a:blip r:embed="rId30"/>
+                    <a:stretch>
+                      <a:fillRect/>
+                    </a:stretch>
+                  </pic:blipFill>
+                  <pic:spPr>
+                    <a:xfrm>
+                      <a:off x="0" y="0"/>
+                      <a:ext cx="4529647" cy="2824882"/>
+                    </a:xfrm>
+                    <a:prstGeom prst="rect">
+                      <a:avLst/>
+                    </a:prstGeom>
+                  </pic:spPr>
+                </pic:pic>
+              </a:graphicData>
+            </a:graphic>
+          </wp:inline>
+        </w:drawing>
+      </w:r>
+    </w:p>
+    <w:p>
+      <w:pPr>
+        <w:pStyle w:val="ListParagraph"/>
+        <w:numPr>
+          <w:ilvl w:val="2"/>
+          <w:numId w:val="1"/>
+        </w:numPr>
+        <w:rPr>
+          <w:b/>
+          <w:bCs/>
+          <w:sz w:val="28"/>
+          <w:szCs w:val="28"/>
+        </w:rPr>
+      </w:pPr>
+      <w:r>
+        <w:rPr>
+          <w:b/>
+          <w:bCs/>
+          <w:sz w:val="28"/>
+          <w:szCs w:val="28"/>
+        </w:rPr>
+        <w:drawing>
+          <wp:inline distT="0" distB="0" distL="0" distR="0" wp14:anchorId="23393E32" wp14:editId="17CD1351">
+            <wp:extent cx="4542790" cy="2528078"/>
+            <wp:effectExtent l="0" t="0" r="0" b="5715"/>
+            <wp:docPr id="1598245901" name="Picture 1"/>
+            <wp:cNvGraphicFramePr>
+              <a:graphicFrameLocks xmlns:a="http://schemas.openxmlformats.org/drawingml/2006/main" noChangeAspect="1"/>
+            </wp:cNvGraphicFramePr>
+            <a:graphic xmlns:a="http://schemas.openxmlformats.org/drawingml/2006/main">
+              <a:graphicData uri="http://schemas.openxmlformats.org/drawingml/2006/picture">
+                <pic:pic xmlns:pic="http://schemas.openxmlformats.org/drawingml/2006/picture">
+                  <pic:nvPicPr>
+                    <pic:cNvPr id="1598245901" name=""/>
+                    <pic:cNvPicPr/>
+                  </pic:nvPicPr>
+                  <pic:blipFill>
+                    <a:blip r:embed="rId31"/>
+                    <a:stretch>
+                      <a:fillRect/>
+                    </a:stretch>
+                  </pic:blipFill>
+                  <pic:spPr>
+                    <a:xfrm>
+                      <a:off x="0" y="0"/>
+                      <a:ext cx="4550503" cy="2532370"/>
+                    </a:xfrm>
+                    <a:prstGeom prst="rect">
+                      <a:avLst/>
+                    </a:prstGeom>
+                  </pic:spPr>
+                </pic:pic>
+              </a:graphicData>
+            </a:graphic>
+          </wp:inline>
+        </w:drawing>
+      </w:r>
+    </w:p>
+    <w:p>
+      <w:pPr>
+        <w:pStyle w:val="ListParagraph"/>
+        <w:numPr>
+          <w:ilvl w:val="2"/>
+          <w:numId w:val="1"/>
+        </w:numPr>
+        <w:rPr>
+          <w:b/>
+          <w:bCs/>
+          <w:sz w:val="28"/>
+          <w:szCs w:val="28"/>
+        </w:rPr>
+      </w:pPr>
+      <w:r>
+        <w:rPr>
+          <w:b/>
+          <w:bCs/>
+          <w:sz w:val="28"/>
+          <w:szCs w:val="28"/>
+        </w:rPr>
+        <w:drawing>
+          <wp:inline distT="0" distB="0" distL="0" distR="0" wp14:anchorId="3A68FB82" wp14:editId="23932F61">
+            <wp:extent cx="4603750" cy="2421738"/>
+            <wp:effectExtent l="0" t="0" r="6350" b="0"/>
+            <wp:docPr id="1502713411" name="Picture 1"/>
+            <wp:cNvGraphicFramePr>
+              <a:graphicFrameLocks xmlns:a="http://schemas.openxmlformats.org/drawingml/2006/main" noChangeAspect="1"/>
+            </wp:cNvGraphicFramePr>
+            <a:graphic xmlns:a="http://schemas.openxmlformats.org/drawingml/2006/main">
+              <a:graphicData uri="http://schemas.openxmlformats.org/drawingml/2006/picture">
+                <pic:pic xmlns:pic="http://schemas.openxmlformats.org/drawingml/2006/picture">
+                  <pic:nvPicPr>
+                    <pic:cNvPr id="1502713411" name=""/>
+                    <pic:cNvPicPr/>
+                  </pic:nvPicPr>
+                  <pic:blipFill>
+                    <a:blip r:embed="rId32"/>
+                    <a:stretch>
+                      <a:fillRect/>
+                    </a:stretch>
+                  </pic:blipFill>
+                  <pic:spPr>
+                    <a:xfrm>
+                      <a:off x="0" y="0"/>
+                      <a:ext cx="4618946" cy="2429732"/>
+                    </a:xfrm>
+                    <a:prstGeom prst="rect">
+                      <a:avLst/>
+                    </a:prstGeom>
+                  </pic:spPr>
+                </pic:pic>
+              </a:graphicData>
+            </a:graphic>
+          </wp:inline>
+        </w:drawing>
+      </w:r>
+    </w:p>
+    <w:p>
+      <w:pPr>
+        <w:pStyle w:val="ListParagraph"/>
+        <w:numPr>
+          <w:ilvl w:val="2"/>
+          <w:numId w:val="1"/>
+        </w:numPr>
+        <w:rPr>
+          <w:b/>
+          <w:bCs/>
+          <w:sz w:val="28"/>
+          <w:szCs w:val="28"/>
+        </w:rPr>
+      </w:pPr>
+      <w:r>
+        <w:rPr>
+          <w:b/>
+          <w:bCs/>
+          <w:sz w:val="28"/>
+          <w:szCs w:val="28"/>
+        </w:rPr>
+        <w:drawing>
+          <wp:inline distT="0" distB="0" distL="0" distR="0" wp14:anchorId="0A6E7FA9" wp14:editId="715F3F32">
+            <wp:extent cx="4611370" cy="1551088"/>
+            <wp:effectExtent l="0" t="0" r="0" b="0"/>
+            <wp:docPr id="1510584678" name="Picture 1"/>
+            <wp:cNvGraphicFramePr>
+              <a:graphicFrameLocks xmlns:a="http://schemas.openxmlformats.org/drawingml/2006/main" noChangeAspect="1"/>
+            </wp:cNvGraphicFramePr>
+            <a:graphic xmlns:a="http://schemas.openxmlformats.org/drawingml/2006/main">
+              <a:graphicData uri="http://schemas.openxmlformats.org/drawingml/2006/picture">
+                <pic:pic xmlns:pic="http://schemas.openxmlformats.org/drawingml/2006/picture">
+                  <pic:nvPicPr>
+                    <pic:cNvPr id="1510584678" name=""/>
+                    <pic:cNvPicPr/>
+                  </pic:nvPicPr>
+                  <pic:blipFill>
+                    <a:blip r:embed="rId33"/>
+                    <a:stretch>
+                      <a:fillRect/>
+                    </a:stretch>
+                  </pic:blipFill>
+                  <pic:spPr>
+                    <a:xfrm>
+                      <a:off x="0" y="0"/>
+                      <a:ext cx="4624597" cy="1555537"/>
+                    </a:xfrm>
+                    <a:prstGeom prst="rect">
+                      <a:avLst/>
+                    </a:prstGeom>
+                  </pic:spPr>
+                </pic:pic>
+              </a:graphicData>
+            </a:graphic>
+          </wp:inline>
+        </w:drawing>
+      </w:r>
+    </w:p>
+    <w:p>
+      <w:pPr>
+        <w:rPr>
+          <w:b/>
+          <w:bCs/>
+          <w:sz w:val="28"/>
+          <w:szCs w:val="28"/>
+        </w:rPr>
+      </w:pPr>
+    </w:p>
+    <w:p>
+      <w:pPr>
+        <w:pStyle w:val="ListParagraph"/>
+        <w:numPr>
+          <w:ilvl w:val="0"/>
+          <w:numId w:val="1"/>
+        </w:numPr>
+        <w:rPr>
+          <w:b/>
+          <w:bCs/>
+          <w:sz w:val="28"/>
+          <w:szCs w:val="28"/>
+        </w:rPr>
+      </w:pPr>
+      <w:r>
+        <w:rPr>
+          <w:b/>
+          <w:bCs/>
+          <w:sz w:val="28"/>
+          <w:szCs w:val="28"/>
+        </w:rPr>
+        <w:t>HandsOn – 4 Screenshots</w:t>
+      </w:r>
+    </w:p>
+    <w:p>
+      <w:pPr>
+        <w:pStyle w:val="ListParagraph"/>
+        <w:numPr>
+          <w:ilvl w:val="1"/>
+          <w:numId w:val="1"/>
+        </w:numPr>
+        <w:rPr>
+          <w:b/>
+          <w:bCs/>
+          <w:sz w:val="28"/>
+          <w:szCs w:val="28"/>
+        </w:rPr>
+      </w:pPr>
+      <w:r>
+        <w:rPr>
+          <w:b/>
+          <w:bCs/>
+          <w:sz w:val="28"/>
+          <w:szCs w:val="28"/>
+        </w:rPr>
+        <w:t>Task 1:</w:t>
+      </w:r>
+    </w:p>
+    <w:p>
+      <w:pPr>
+        <w:pStyle w:val="ListParagraph"/>
+        <w:numPr>
+          <w:ilvl w:val="2"/>
+          <w:numId w:val="1"/>
+        </w:numPr>
+        <w:rPr>
+          <w:b/>
+          <w:bCs/>
+          <w:sz w:val="28"/>
+          <w:szCs w:val="28"/>
+        </w:rPr>
+      </w:pPr>
+      <w:r>
+        <w:rPr>
+          <w:b/>
+          <w:bCs/>
+          <w:sz w:val="28"/>
+          <w:szCs w:val="28"/>
+        </w:rPr>
+        <w:drawing>
+          <wp:inline distT="0" distB="0" distL="0" distR="0" wp14:anchorId="729642A2" wp14:editId="268C0EE1">
+            <wp:extent cx="4649470" cy="1758103"/>
+            <wp:effectExtent l="0" t="0" r="0" b="0"/>
+            <wp:docPr id="2130193487" name="Picture 1"/>
+            <wp:cNvGraphicFramePr>
+              <a:graphicFrameLocks xmlns:a="http://schemas.openxmlformats.org/drawingml/2006/main" noChangeAspect="1"/>
+            </wp:cNvGraphicFramePr>
+            <a:graphic xmlns:a="http://schemas.openxmlformats.org/drawingml/2006/main">
+              <a:graphicData uri="http://schemas.openxmlformats.org/drawingml/2006/picture">
+                <pic:pic xmlns:pic="http://schemas.openxmlformats.org/drawingml/2006/picture">
+                  <pic:nvPicPr>
+                    <pic:cNvPr id="2130193487" name=""/>
+                    <pic:cNvPicPr/>
+                  </pic:nvPicPr>
+                  <pic:blipFill>
+                    <a:blip r:embed="rId34"/>
+                    <a:stretch>
+                      <a:fillRect/>
+                    </a:stretch>
+                  </pic:blipFill>
+                  <pic:spPr>
+                    <a:xfrm>
+                      <a:off x="0" y="0"/>
+                      <a:ext cx="4671931" cy="1766596"/>
+                    </a:xfrm>
+                    <a:prstGeom prst="rect">
+                      <a:avLst/>
+                    </a:prstGeom>
+                  </pic:spPr>
+                </pic:pic>
+              </a:graphicData>
+            </a:graphic>
+          </wp:inline>
+        </w:drawing>
+      </w:r>
     </w:p>
     <w:sectPr>
       <w:pgSz w:w="11906" w:h="16838"/>

</xml_diff>

<commit_message>
complete Angular handson 5
</commit_message>
<xml_diff>
--- a/Angular_HandsOn/Angular.docx
+++ b/Angular_HandsOn/Angular.docx
@@ -1627,6 +1627,7 @@
         <w:rPr>
           <w:b/>
           <w:bCs/>
+          <w:noProof/>
           <w:sz w:val="28"/>
           <w:szCs w:val="28"/>
         </w:rPr>
@@ -1685,6 +1686,7 @@
         <w:rPr>
           <w:b/>
           <w:bCs/>
+          <w:noProof/>
           <w:sz w:val="28"/>
           <w:szCs w:val="28"/>
         </w:rPr>
@@ -1777,6 +1779,7 @@
         <w:rPr>
           <w:b/>
           <w:bCs/>
+          <w:noProof/>
           <w:sz w:val="28"/>
           <w:szCs w:val="28"/>
         </w:rPr>
@@ -1835,6 +1838,7 @@
         <w:rPr>
           <w:b/>
           <w:bCs/>
+          <w:noProof/>
           <w:sz w:val="28"/>
           <w:szCs w:val="28"/>
         </w:rPr>
@@ -1893,6 +1897,7 @@
         <w:rPr>
           <w:b/>
           <w:bCs/>
+          <w:noProof/>
           <w:sz w:val="28"/>
           <w:szCs w:val="28"/>
         </w:rPr>
@@ -1985,6 +1990,7 @@
         <w:rPr>
           <w:b/>
           <w:bCs/>
+          <w:noProof/>
           <w:sz w:val="28"/>
           <w:szCs w:val="28"/>
         </w:rPr>
@@ -2043,6 +2049,7 @@
         <w:rPr>
           <w:b/>
           <w:bCs/>
+          <w:noProof/>
           <w:sz w:val="28"/>
           <w:szCs w:val="28"/>
         </w:rPr>
@@ -2101,6 +2108,7 @@
         <w:rPr>
           <w:b/>
           <w:bCs/>
+          <w:noProof/>
           <w:sz w:val="28"/>
           <w:szCs w:val="28"/>
         </w:rPr>
@@ -2159,6 +2167,7 @@
         <w:rPr>
           <w:b/>
           <w:bCs/>
+          <w:noProof/>
           <w:sz w:val="28"/>
           <w:szCs w:val="28"/>
         </w:rPr>
@@ -2275,12 +2284,131 @@
         <w:rPr>
           <w:b/>
           <w:bCs/>
+          <w:noProof/>
           <w:sz w:val="28"/>
           <w:szCs w:val="28"/>
         </w:rPr>
         <w:drawing>
-          <wp:inline distT="0" distB="0" distL="0" distR="0" wp14:anchorId="729642A2" wp14:editId="268C0EE1">
-            <wp:extent cx="4649470" cy="1758103"/>
+          <wp:inline distT="0" distB="0" distL="0" distR="0" wp14:anchorId="47117A0D" wp14:editId="04842F20">
+            <wp:extent cx="4267200" cy="2588876"/>
+            <wp:effectExtent l="0" t="0" r="0" b="2540"/>
+            <wp:docPr id="411174673" name="Picture 1"/>
+            <wp:cNvGraphicFramePr>
+              <a:graphicFrameLocks xmlns:a="http://schemas.openxmlformats.org/drawingml/2006/main" noChangeAspect="1"/>
+            </wp:cNvGraphicFramePr>
+            <a:graphic xmlns:a="http://schemas.openxmlformats.org/drawingml/2006/main">
+              <a:graphicData uri="http://schemas.openxmlformats.org/drawingml/2006/picture">
+                <pic:pic xmlns:pic="http://schemas.openxmlformats.org/drawingml/2006/picture">
+                  <pic:nvPicPr>
+                    <pic:cNvPr id="411174673" name=""/>
+                    <pic:cNvPicPr/>
+                  </pic:nvPicPr>
+                  <pic:blipFill>
+                    <a:blip r:embed="rId34"/>
+                    <a:stretch>
+                      <a:fillRect/>
+                    </a:stretch>
+                  </pic:blipFill>
+                  <pic:spPr>
+                    <a:xfrm>
+                      <a:off x="0" y="0"/>
+                      <a:ext cx="4307799" cy="2613507"/>
+                    </a:xfrm>
+                    <a:prstGeom prst="rect">
+                      <a:avLst/>
+                    </a:prstGeom>
+                  </pic:spPr>
+                </pic:pic>
+              </a:graphicData>
+            </a:graphic>
+          </wp:inline>
+        </w:drawing>
+      </w:r>
+    </w:p>
+    <w:p>
+      <w:pPr>
+        <w:pStyle w:val="ListParagraph"/>
+        <w:numPr>
+          <w:ilvl w:val="2"/>
+          <w:numId w:val="1"/>
+        </w:numPr>
+        <w:rPr>
+          <w:b/>
+          <w:bCs/>
+          <w:sz w:val="28"/>
+          <w:szCs w:val="28"/>
+        </w:rPr>
+      </w:pPr>
+      <w:r>
+        <w:rPr>
+          <w:b/>
+          <w:bCs/>
+          <w:noProof/>
+          <w:sz w:val="28"/>
+          <w:szCs w:val="28"/>
+        </w:rPr>
+        <w:drawing>
+          <wp:inline distT="0" distB="0" distL="0" distR="0" wp14:anchorId="5A1F8DDB" wp14:editId="0791FCAE">
+            <wp:extent cx="4253230" cy="2789150"/>
+            <wp:effectExtent l="0" t="0" r="0" b="0"/>
+            <wp:docPr id="295410568" name="Picture 1"/>
+            <wp:cNvGraphicFramePr>
+              <a:graphicFrameLocks xmlns:a="http://schemas.openxmlformats.org/drawingml/2006/main" noChangeAspect="1"/>
+            </wp:cNvGraphicFramePr>
+            <a:graphic xmlns:a="http://schemas.openxmlformats.org/drawingml/2006/main">
+              <a:graphicData uri="http://schemas.openxmlformats.org/drawingml/2006/picture">
+                <pic:pic xmlns:pic="http://schemas.openxmlformats.org/drawingml/2006/picture">
+                  <pic:nvPicPr>
+                    <pic:cNvPr id="295410568" name=""/>
+                    <pic:cNvPicPr/>
+                  </pic:nvPicPr>
+                  <pic:blipFill>
+                    <a:blip r:embed="rId35"/>
+                    <a:stretch>
+                      <a:fillRect/>
+                    </a:stretch>
+                  </pic:blipFill>
+                  <pic:spPr>
+                    <a:xfrm>
+                      <a:off x="0" y="0"/>
+                      <a:ext cx="4261505" cy="2794576"/>
+                    </a:xfrm>
+                    <a:prstGeom prst="rect">
+                      <a:avLst/>
+                    </a:prstGeom>
+                  </pic:spPr>
+                </pic:pic>
+              </a:graphicData>
+            </a:graphic>
+          </wp:inline>
+        </w:drawing>
+      </w:r>
+    </w:p>
+    <w:p>
+      <w:pPr>
+        <w:pStyle w:val="ListParagraph"/>
+        <w:numPr>
+          <w:ilvl w:val="2"/>
+          <w:numId w:val="1"/>
+        </w:numPr>
+        <w:rPr>
+          <w:b/>
+          <w:bCs/>
+          <w:sz w:val="28"/>
+          <w:szCs w:val="28"/>
+        </w:rPr>
+      </w:pPr>
+      <w:r>
+        <w:rPr>
+          <w:b/>
+          <w:bCs/>
+          <w:noProof/>
+          <w:sz w:val="28"/>
+          <w:szCs w:val="28"/>
+        </w:rPr>
+        <w:drawing>
+          <wp:inline distT="0" distB="0" distL="0" distR="0" wp14:anchorId="0ED28EC2" wp14:editId="3EBB5FA0">
+            <wp:extent cx="4937195" cy="1866900"/>
             <wp:effectExtent l="0" t="0" r="0" b="0"/>
             <wp:docPr id="2130193487" name="Picture 1"/>
             <wp:cNvGraphicFramePr>
@@ -2294,7 +2422,7 @@
                     <pic:cNvPicPr/>
                   </pic:nvPicPr>
                   <pic:blipFill>
-                    <a:blip r:embed="rId34"/>
+                    <a:blip r:embed="rId36"/>
                     <a:stretch>
                       <a:fillRect/>
                     </a:stretch>
@@ -2302,7 +2430,7 @@
                   <pic:spPr>
                     <a:xfrm>
                       <a:off x="0" y="0"/>
-                      <a:ext cx="4671931" cy="1766596"/>
+                      <a:ext cx="4967352" cy="1878303"/>
                     </a:xfrm>
                     <a:prstGeom prst="rect">
                       <a:avLst/>
@@ -2314,6 +2442,696 @@
           </wp:inline>
         </w:drawing>
       </w:r>
+    </w:p>
+    <w:p>
+      <w:pPr>
+        <w:rPr>
+          <w:b/>
+          <w:bCs/>
+          <w:sz w:val="28"/>
+          <w:szCs w:val="28"/>
+        </w:rPr>
+      </w:pPr>
+    </w:p>
+    <w:p>
+      <w:pPr>
+        <w:pStyle w:val="ListParagraph"/>
+        <w:numPr>
+          <w:ilvl w:val="1"/>
+          <w:numId w:val="1"/>
+        </w:numPr>
+        <w:rPr>
+          <w:b/>
+          <w:bCs/>
+          <w:sz w:val="28"/>
+          <w:szCs w:val="28"/>
+        </w:rPr>
+      </w:pPr>
+      <w:r>
+        <w:rPr>
+          <w:b/>
+          <w:bCs/>
+          <w:sz w:val="28"/>
+          <w:szCs w:val="28"/>
+        </w:rPr>
+        <w:t>Task 2:</w:t>
+      </w:r>
+    </w:p>
+    <w:p>
+      <w:pPr>
+        <w:pStyle w:val="ListParagraph"/>
+        <w:numPr>
+          <w:ilvl w:val="2"/>
+          <w:numId w:val="1"/>
+        </w:numPr>
+        <w:rPr>
+          <w:b/>
+          <w:bCs/>
+          <w:sz w:val="28"/>
+          <w:szCs w:val="28"/>
+        </w:rPr>
+      </w:pPr>
+      <w:r>
+        <w:rPr>
+          <w:b/>
+          <w:bCs/>
+          <w:noProof/>
+          <w:sz w:val="28"/>
+          <w:szCs w:val="28"/>
+        </w:rPr>
+        <w:drawing>
+          <wp:inline distT="0" distB="0" distL="0" distR="0" wp14:anchorId="57B2C58E" wp14:editId="37DBCD6D">
+            <wp:extent cx="4634230" cy="1918179"/>
+            <wp:effectExtent l="0" t="0" r="0" b="6350"/>
+            <wp:docPr id="136163555" name="Picture 1"/>
+            <wp:cNvGraphicFramePr>
+              <a:graphicFrameLocks xmlns:a="http://schemas.openxmlformats.org/drawingml/2006/main" noChangeAspect="1"/>
+            </wp:cNvGraphicFramePr>
+            <a:graphic xmlns:a="http://schemas.openxmlformats.org/drawingml/2006/main">
+              <a:graphicData uri="http://schemas.openxmlformats.org/drawingml/2006/picture">
+                <pic:pic xmlns:pic="http://schemas.openxmlformats.org/drawingml/2006/picture">
+                  <pic:nvPicPr>
+                    <pic:cNvPr id="136163555" name=""/>
+                    <pic:cNvPicPr/>
+                  </pic:nvPicPr>
+                  <pic:blipFill>
+                    <a:blip r:embed="rId37"/>
+                    <a:stretch>
+                      <a:fillRect/>
+                    </a:stretch>
+                  </pic:blipFill>
+                  <pic:spPr>
+                    <a:xfrm>
+                      <a:off x="0" y="0"/>
+                      <a:ext cx="4644070" cy="1922252"/>
+                    </a:xfrm>
+                    <a:prstGeom prst="rect">
+                      <a:avLst/>
+                    </a:prstGeom>
+                  </pic:spPr>
+                </pic:pic>
+              </a:graphicData>
+            </a:graphic>
+          </wp:inline>
+        </w:drawing>
+      </w:r>
+    </w:p>
+    <w:p>
+      <w:pPr>
+        <w:pStyle w:val="ListParagraph"/>
+        <w:numPr>
+          <w:ilvl w:val="2"/>
+          <w:numId w:val="1"/>
+        </w:numPr>
+        <w:rPr>
+          <w:b/>
+          <w:bCs/>
+          <w:sz w:val="28"/>
+          <w:szCs w:val="28"/>
+        </w:rPr>
+      </w:pPr>
+      <w:r>
+        <w:rPr>
+          <w:b/>
+          <w:bCs/>
+          <w:noProof/>
+          <w:sz w:val="28"/>
+          <w:szCs w:val="28"/>
+        </w:rPr>
+        <w:drawing>
+          <wp:inline distT="0" distB="0" distL="0" distR="0" wp14:anchorId="76D13093" wp14:editId="155954B7">
+            <wp:extent cx="4382770" cy="2087958"/>
+            <wp:effectExtent l="0" t="0" r="0" b="7620"/>
+            <wp:docPr id="67032115" name="Picture 1"/>
+            <wp:cNvGraphicFramePr>
+              <a:graphicFrameLocks xmlns:a="http://schemas.openxmlformats.org/drawingml/2006/main" noChangeAspect="1"/>
+            </wp:cNvGraphicFramePr>
+            <a:graphic xmlns:a="http://schemas.openxmlformats.org/drawingml/2006/main">
+              <a:graphicData uri="http://schemas.openxmlformats.org/drawingml/2006/picture">
+                <pic:pic xmlns:pic="http://schemas.openxmlformats.org/drawingml/2006/picture">
+                  <pic:nvPicPr>
+                    <pic:cNvPr id="67032115" name=""/>
+                    <pic:cNvPicPr/>
+                  </pic:nvPicPr>
+                  <pic:blipFill>
+                    <a:blip r:embed="rId38"/>
+                    <a:stretch>
+                      <a:fillRect/>
+                    </a:stretch>
+                  </pic:blipFill>
+                  <pic:spPr>
+                    <a:xfrm>
+                      <a:off x="0" y="0"/>
+                      <a:ext cx="4391123" cy="2091937"/>
+                    </a:xfrm>
+                    <a:prstGeom prst="rect">
+                      <a:avLst/>
+                    </a:prstGeom>
+                  </pic:spPr>
+                </pic:pic>
+              </a:graphicData>
+            </a:graphic>
+          </wp:inline>
+        </w:drawing>
+      </w:r>
+    </w:p>
+    <w:p>
+      <w:pPr>
+        <w:pStyle w:val="ListParagraph"/>
+        <w:numPr>
+          <w:ilvl w:val="2"/>
+          <w:numId w:val="1"/>
+        </w:numPr>
+        <w:rPr>
+          <w:b/>
+          <w:bCs/>
+          <w:sz w:val="28"/>
+          <w:szCs w:val="28"/>
+        </w:rPr>
+      </w:pPr>
+      <w:r>
+        <w:rPr>
+          <w:b/>
+          <w:bCs/>
+          <w:noProof/>
+          <w:sz w:val="28"/>
+          <w:szCs w:val="28"/>
+        </w:rPr>
+        <w:drawing>
+          <wp:inline distT="0" distB="0" distL="0" distR="0" wp14:anchorId="23836A6F" wp14:editId="0F72A801">
+            <wp:extent cx="4413250" cy="2499505"/>
+            <wp:effectExtent l="0" t="0" r="6350" b="0"/>
+            <wp:docPr id="228404605" name="Picture 1"/>
+            <wp:cNvGraphicFramePr>
+              <a:graphicFrameLocks xmlns:a="http://schemas.openxmlformats.org/drawingml/2006/main" noChangeAspect="1"/>
+            </wp:cNvGraphicFramePr>
+            <a:graphic xmlns:a="http://schemas.openxmlformats.org/drawingml/2006/main">
+              <a:graphicData uri="http://schemas.openxmlformats.org/drawingml/2006/picture">
+                <pic:pic xmlns:pic="http://schemas.openxmlformats.org/drawingml/2006/picture">
+                  <pic:nvPicPr>
+                    <pic:cNvPr id="228404605" name=""/>
+                    <pic:cNvPicPr/>
+                  </pic:nvPicPr>
+                  <pic:blipFill>
+                    <a:blip r:embed="rId39"/>
+                    <a:stretch>
+                      <a:fillRect/>
+                    </a:stretch>
+                  </pic:blipFill>
+                  <pic:spPr>
+                    <a:xfrm>
+                      <a:off x="0" y="0"/>
+                      <a:ext cx="4423855" cy="2505511"/>
+                    </a:xfrm>
+                    <a:prstGeom prst="rect">
+                      <a:avLst/>
+                    </a:prstGeom>
+                  </pic:spPr>
+                </pic:pic>
+              </a:graphicData>
+            </a:graphic>
+          </wp:inline>
+        </w:drawing>
+      </w:r>
+    </w:p>
+    <w:p>
+      <w:pPr>
+        <w:pStyle w:val="ListParagraph"/>
+        <w:numPr>
+          <w:ilvl w:val="2"/>
+          <w:numId w:val="1"/>
+        </w:numPr>
+        <w:rPr>
+          <w:b/>
+          <w:bCs/>
+          <w:sz w:val="28"/>
+          <w:szCs w:val="28"/>
+        </w:rPr>
+      </w:pPr>
+      <w:r>
+        <w:rPr>
+          <w:b/>
+          <w:bCs/>
+          <w:noProof/>
+          <w:sz w:val="28"/>
+          <w:szCs w:val="28"/>
+        </w:rPr>
+        <w:drawing>
+          <wp:inline distT="0" distB="0" distL="0" distR="0" wp14:anchorId="26830165" wp14:editId="06F486D2">
+            <wp:extent cx="4748530" cy="3088701"/>
+            <wp:effectExtent l="0" t="0" r="0" b="0"/>
+            <wp:docPr id="1155000539" name="Picture 1"/>
+            <wp:cNvGraphicFramePr>
+              <a:graphicFrameLocks xmlns:a="http://schemas.openxmlformats.org/drawingml/2006/main" noChangeAspect="1"/>
+            </wp:cNvGraphicFramePr>
+            <a:graphic xmlns:a="http://schemas.openxmlformats.org/drawingml/2006/main">
+              <a:graphicData uri="http://schemas.openxmlformats.org/drawingml/2006/picture">
+                <pic:pic xmlns:pic="http://schemas.openxmlformats.org/drawingml/2006/picture">
+                  <pic:nvPicPr>
+                    <pic:cNvPr id="1155000539" name=""/>
+                    <pic:cNvPicPr/>
+                  </pic:nvPicPr>
+                  <pic:blipFill>
+                    <a:blip r:embed="rId40"/>
+                    <a:stretch>
+                      <a:fillRect/>
+                    </a:stretch>
+                  </pic:blipFill>
+                  <pic:spPr>
+                    <a:xfrm>
+                      <a:off x="0" y="0"/>
+                      <a:ext cx="4754374" cy="3092502"/>
+                    </a:xfrm>
+                    <a:prstGeom prst="rect">
+                      <a:avLst/>
+                    </a:prstGeom>
+                  </pic:spPr>
+                </pic:pic>
+              </a:graphicData>
+            </a:graphic>
+          </wp:inline>
+        </w:drawing>
+      </w:r>
+    </w:p>
+    <w:p>
+      <w:pPr>
+        <w:pStyle w:val="ListParagraph"/>
+        <w:numPr>
+          <w:ilvl w:val="2"/>
+          <w:numId w:val="1"/>
+        </w:numPr>
+        <w:rPr>
+          <w:b/>
+          <w:bCs/>
+          <w:sz w:val="28"/>
+          <w:szCs w:val="28"/>
+        </w:rPr>
+      </w:pPr>
+      <w:r>
+        <w:rPr>
+          <w:b/>
+          <w:bCs/>
+          <w:noProof/>
+          <w:sz w:val="28"/>
+          <w:szCs w:val="28"/>
+        </w:rPr>
+        <w:drawing>
+          <wp:inline distT="0" distB="0" distL="0" distR="0" wp14:anchorId="0E84225E" wp14:editId="0643082F">
+            <wp:extent cx="4809490" cy="2507052"/>
+            <wp:effectExtent l="0" t="0" r="0" b="7620"/>
+            <wp:docPr id="1669790390" name="Picture 1"/>
+            <wp:cNvGraphicFramePr>
+              <a:graphicFrameLocks xmlns:a="http://schemas.openxmlformats.org/drawingml/2006/main" noChangeAspect="1"/>
+            </wp:cNvGraphicFramePr>
+            <a:graphic xmlns:a="http://schemas.openxmlformats.org/drawingml/2006/main">
+              <a:graphicData uri="http://schemas.openxmlformats.org/drawingml/2006/picture">
+                <pic:pic xmlns:pic="http://schemas.openxmlformats.org/drawingml/2006/picture">
+                  <pic:nvPicPr>
+                    <pic:cNvPr id="1669790390" name=""/>
+                    <pic:cNvPicPr/>
+                  </pic:nvPicPr>
+                  <pic:blipFill>
+                    <a:blip r:embed="rId41"/>
+                    <a:stretch>
+                      <a:fillRect/>
+                    </a:stretch>
+                  </pic:blipFill>
+                  <pic:spPr>
+                    <a:xfrm>
+                      <a:off x="0" y="0"/>
+                      <a:ext cx="4814816" cy="2509828"/>
+                    </a:xfrm>
+                    <a:prstGeom prst="rect">
+                      <a:avLst/>
+                    </a:prstGeom>
+                  </pic:spPr>
+                </pic:pic>
+              </a:graphicData>
+            </a:graphic>
+          </wp:inline>
+        </w:drawing>
+      </w:r>
+    </w:p>
+    <w:p>
+      <w:pPr>
+        <w:rPr>
+          <w:b/>
+          <w:bCs/>
+          <w:sz w:val="28"/>
+          <w:szCs w:val="28"/>
+        </w:rPr>
+      </w:pPr>
+    </w:p>
+    <w:p>
+      <w:pPr>
+        <w:pStyle w:val="ListParagraph"/>
+        <w:numPr>
+          <w:ilvl w:val="0"/>
+          <w:numId w:val="1"/>
+        </w:numPr>
+        <w:rPr>
+          <w:b/>
+          <w:bCs/>
+          <w:sz w:val="28"/>
+          <w:szCs w:val="28"/>
+        </w:rPr>
+      </w:pPr>
+      <w:r>
+        <w:rPr>
+          <w:b/>
+          <w:bCs/>
+          <w:sz w:val="28"/>
+          <w:szCs w:val="28"/>
+        </w:rPr>
+        <w:t>HandsOn – 5 Screenshots</w:t>
+      </w:r>
+    </w:p>
+    <w:p>
+      <w:pPr>
+        <w:pStyle w:val="ListParagraph"/>
+        <w:numPr>
+          <w:ilvl w:val="1"/>
+          <w:numId w:val="1"/>
+        </w:numPr>
+        <w:rPr>
+          <w:b/>
+          <w:bCs/>
+          <w:sz w:val="28"/>
+          <w:szCs w:val="28"/>
+        </w:rPr>
+      </w:pPr>
+      <w:r>
+        <w:rPr>
+          <w:b/>
+          <w:bCs/>
+          <w:sz w:val="28"/>
+          <w:szCs w:val="28"/>
+        </w:rPr>
+        <w:t>Task 1:</w:t>
+      </w:r>
+    </w:p>
+    <w:p>
+      <w:pPr>
+        <w:pStyle w:val="ListParagraph"/>
+        <w:numPr>
+          <w:ilvl w:val="2"/>
+          <w:numId w:val="1"/>
+        </w:numPr>
+        <w:rPr>
+          <w:b/>
+          <w:bCs/>
+          <w:sz w:val="28"/>
+          <w:szCs w:val="28"/>
+        </w:rPr>
+      </w:pPr>
+      <w:r>
+        <w:rPr>
+          <w:b/>
+          <w:bCs/>
+          <w:noProof/>
+          <w:sz w:val="28"/>
+          <w:szCs w:val="28"/>
+        </w:rPr>
+        <w:drawing>
+          <wp:inline distT="0" distB="0" distL="0" distR="0" wp14:anchorId="22EE8201" wp14:editId="50CB29F0">
+            <wp:extent cx="4817110" cy="2166259"/>
+            <wp:effectExtent l="0" t="0" r="2540" b="5715"/>
+            <wp:docPr id="433659251" name="Picture 1"/>
+            <wp:cNvGraphicFramePr>
+              <a:graphicFrameLocks xmlns:a="http://schemas.openxmlformats.org/drawingml/2006/main" noChangeAspect="1"/>
+            </wp:cNvGraphicFramePr>
+            <a:graphic xmlns:a="http://schemas.openxmlformats.org/drawingml/2006/main">
+              <a:graphicData uri="http://schemas.openxmlformats.org/drawingml/2006/picture">
+                <pic:pic xmlns:pic="http://schemas.openxmlformats.org/drawingml/2006/picture">
+                  <pic:nvPicPr>
+                    <pic:cNvPr id="433659251" name=""/>
+                    <pic:cNvPicPr/>
+                  </pic:nvPicPr>
+                  <pic:blipFill>
+                    <a:blip r:embed="rId42"/>
+                    <a:stretch>
+                      <a:fillRect/>
+                    </a:stretch>
+                  </pic:blipFill>
+                  <pic:spPr>
+                    <a:xfrm>
+                      <a:off x="0" y="0"/>
+                      <a:ext cx="4826237" cy="2170364"/>
+                    </a:xfrm>
+                    <a:prstGeom prst="rect">
+                      <a:avLst/>
+                    </a:prstGeom>
+                  </pic:spPr>
+                </pic:pic>
+              </a:graphicData>
+            </a:graphic>
+          </wp:inline>
+        </w:drawing>
+      </w:r>
+    </w:p>
+    <w:p>
+      <w:pPr>
+        <w:pStyle w:val="ListParagraph"/>
+        <w:numPr>
+          <w:ilvl w:val="2"/>
+          <w:numId w:val="1"/>
+        </w:numPr>
+        <w:rPr>
+          <w:b/>
+          <w:bCs/>
+          <w:sz w:val="28"/>
+          <w:szCs w:val="28"/>
+        </w:rPr>
+      </w:pPr>
+      <w:r>
+        <w:rPr>
+          <w:b/>
+          <w:bCs/>
+          <w:noProof/>
+          <w:sz w:val="28"/>
+          <w:szCs w:val="28"/>
+        </w:rPr>
+        <w:drawing>
+          <wp:inline distT="0" distB="0" distL="0" distR="0" wp14:anchorId="6F47E0C9" wp14:editId="141C1859">
+            <wp:extent cx="4847590" cy="1694992"/>
+            <wp:effectExtent l="0" t="0" r="0" b="635"/>
+            <wp:docPr id="261892728" name="Picture 1"/>
+            <wp:cNvGraphicFramePr>
+              <a:graphicFrameLocks xmlns:a="http://schemas.openxmlformats.org/drawingml/2006/main" noChangeAspect="1"/>
+            </wp:cNvGraphicFramePr>
+            <a:graphic xmlns:a="http://schemas.openxmlformats.org/drawingml/2006/main">
+              <a:graphicData uri="http://schemas.openxmlformats.org/drawingml/2006/picture">
+                <pic:pic xmlns:pic="http://schemas.openxmlformats.org/drawingml/2006/picture">
+                  <pic:nvPicPr>
+                    <pic:cNvPr id="261892728" name=""/>
+                    <pic:cNvPicPr/>
+                  </pic:nvPicPr>
+                  <pic:blipFill>
+                    <a:blip r:embed="rId43"/>
+                    <a:stretch>
+                      <a:fillRect/>
+                    </a:stretch>
+                  </pic:blipFill>
+                  <pic:spPr>
+                    <a:xfrm>
+                      <a:off x="0" y="0"/>
+                      <a:ext cx="4862618" cy="1700247"/>
+                    </a:xfrm>
+                    <a:prstGeom prst="rect">
+                      <a:avLst/>
+                    </a:prstGeom>
+                  </pic:spPr>
+                </pic:pic>
+              </a:graphicData>
+            </a:graphic>
+          </wp:inline>
+        </w:drawing>
+      </w:r>
+    </w:p>
+    <w:p>
+      <w:pPr>
+        <w:pStyle w:val="ListParagraph"/>
+        <w:numPr>
+          <w:ilvl w:val="2"/>
+          <w:numId w:val="1"/>
+        </w:numPr>
+        <w:rPr>
+          <w:b/>
+          <w:bCs/>
+          <w:sz w:val="28"/>
+          <w:szCs w:val="28"/>
+        </w:rPr>
+      </w:pPr>
+      <w:r>
+        <w:rPr>
+          <w:b/>
+          <w:bCs/>
+          <w:noProof/>
+          <w:sz w:val="28"/>
+          <w:szCs w:val="28"/>
+        </w:rPr>
+        <w:drawing>
+          <wp:inline distT="0" distB="0" distL="0" distR="0" wp14:anchorId="5C9E6F19" wp14:editId="36C9A89C">
+            <wp:extent cx="4710430" cy="2794632"/>
+            <wp:effectExtent l="0" t="0" r="0" b="6350"/>
+            <wp:docPr id="1794093203" name="Picture 1"/>
+            <wp:cNvGraphicFramePr>
+              <a:graphicFrameLocks xmlns:a="http://schemas.openxmlformats.org/drawingml/2006/main" noChangeAspect="1"/>
+            </wp:cNvGraphicFramePr>
+            <a:graphic xmlns:a="http://schemas.openxmlformats.org/drawingml/2006/main">
+              <a:graphicData uri="http://schemas.openxmlformats.org/drawingml/2006/picture">
+                <pic:pic xmlns:pic="http://schemas.openxmlformats.org/drawingml/2006/picture">
+                  <pic:nvPicPr>
+                    <pic:cNvPr id="1794093203" name=""/>
+                    <pic:cNvPicPr/>
+                  </pic:nvPicPr>
+                  <pic:blipFill>
+                    <a:blip r:embed="rId44"/>
+                    <a:stretch>
+                      <a:fillRect/>
+                    </a:stretch>
+                  </pic:blipFill>
+                  <pic:spPr>
+                    <a:xfrm>
+                      <a:off x="0" y="0"/>
+                      <a:ext cx="4718870" cy="2799639"/>
+                    </a:xfrm>
+                    <a:prstGeom prst="rect">
+                      <a:avLst/>
+                    </a:prstGeom>
+                  </pic:spPr>
+                </pic:pic>
+              </a:graphicData>
+            </a:graphic>
+          </wp:inline>
+        </w:drawing>
+      </w:r>
+    </w:p>
+    <w:p>
+      <w:pPr>
+        <w:pStyle w:val="ListParagraph"/>
+        <w:numPr>
+          <w:ilvl w:val="2"/>
+          <w:numId w:val="1"/>
+        </w:numPr>
+        <w:rPr>
+          <w:b/>
+          <w:bCs/>
+          <w:sz w:val="28"/>
+          <w:szCs w:val="28"/>
+        </w:rPr>
+      </w:pPr>
+      <w:r>
+        <w:rPr>
+          <w:b/>
+          <w:bCs/>
+          <w:noProof/>
+          <w:sz w:val="28"/>
+          <w:szCs w:val="28"/>
+        </w:rPr>
+        <w:drawing>
+          <wp:inline distT="0" distB="0" distL="0" distR="0" wp14:anchorId="21352EE5" wp14:editId="2CC090BC">
+            <wp:extent cx="4700213" cy="3820160"/>
+            <wp:effectExtent l="0" t="0" r="5715" b="8890"/>
+            <wp:docPr id="520932492" name="Picture 1"/>
+            <wp:cNvGraphicFramePr>
+              <a:graphicFrameLocks xmlns:a="http://schemas.openxmlformats.org/drawingml/2006/main" noChangeAspect="1"/>
+            </wp:cNvGraphicFramePr>
+            <a:graphic xmlns:a="http://schemas.openxmlformats.org/drawingml/2006/main">
+              <a:graphicData uri="http://schemas.openxmlformats.org/drawingml/2006/picture">
+                <pic:pic xmlns:pic="http://schemas.openxmlformats.org/drawingml/2006/picture">
+                  <pic:nvPicPr>
+                    <pic:cNvPr id="520932492" name=""/>
+                    <pic:cNvPicPr/>
+                  </pic:nvPicPr>
+                  <pic:blipFill>
+                    <a:blip r:embed="rId45"/>
+                    <a:stretch>
+                      <a:fillRect/>
+                    </a:stretch>
+                  </pic:blipFill>
+                  <pic:spPr>
+                    <a:xfrm>
+                      <a:off x="0" y="0"/>
+                      <a:ext cx="4710908" cy="3828853"/>
+                    </a:xfrm>
+                    <a:prstGeom prst="rect">
+                      <a:avLst/>
+                    </a:prstGeom>
+                  </pic:spPr>
+                </pic:pic>
+              </a:graphicData>
+            </a:graphic>
+          </wp:inline>
+        </w:drawing>
+      </w:r>
+    </w:p>
+    <w:p>
+      <w:pPr>
+        <w:rPr>
+          <w:b/>
+          <w:bCs/>
+          <w:sz w:val="28"/>
+          <w:szCs w:val="28"/>
+        </w:rPr>
+      </w:pPr>
+    </w:p>
+    <w:p>
+      <w:pPr>
+        <w:pStyle w:val="ListParagraph"/>
+        <w:numPr>
+          <w:ilvl w:val="1"/>
+          <w:numId w:val="1"/>
+        </w:numPr>
+        <w:rPr>
+          <w:b/>
+          <w:bCs/>
+          <w:sz w:val="28"/>
+          <w:szCs w:val="28"/>
+        </w:rPr>
+      </w:pPr>
+      <w:r>
+        <w:rPr>
+          <w:b/>
+          <w:bCs/>
+          <w:sz w:val="28"/>
+          <w:szCs w:val="28"/>
+        </w:rPr>
+        <w:t xml:space="preserve">Task </w:t>
+      </w:r>
+      <w:r>
+        <w:rPr>
+          <w:b/>
+          <w:bCs/>
+          <w:sz w:val="28"/>
+          <w:szCs w:val="28"/>
+        </w:rPr>
+        <w:t>2</w:t>
+      </w:r>
+      <w:r>
+        <w:rPr>
+          <w:b/>
+          <w:bCs/>
+          <w:sz w:val="28"/>
+          <w:szCs w:val="28"/>
+        </w:rPr>
+        <w:t>:</w:t>
+      </w:r>
+    </w:p>
+    <w:p>
+      <w:pPr>
+        <w:pStyle w:val="ListParagraph"/>
+        <w:numPr>
+          <w:ilvl w:val="2"/>
+          <w:numId w:val="1"/>
+        </w:numPr>
+        <w:rPr>
+          <w:b/>
+          <w:bCs/>
+          <w:sz w:val="28"/>
+          <w:szCs w:val="28"/>
+        </w:rPr>
+      </w:pPr>
     </w:p>
     <w:sectPr>
       <w:pgSz w:w="11906" w:h="16838"/>

</xml_diff>